<commit_message>
feat: validate profile experiences and harden generation
</commit_message>
<xml_diff>
--- a/templates/base_cv.docx
+++ b/templates/base_cv.docx
@@ -31,12 +31,12 @@
           <wp:anchor allowOverlap="1" behindDoc="0" distB="114300" distT="114300" distL="114300" distR="114300" hidden="0" layoutInCell="1" locked="0" relativeHeight="0" simplePos="0">
             <wp:simplePos x="0" y="0"/>
             <wp:positionH relativeFrom="column">
-              <wp:posOffset>4</wp:posOffset>
+              <wp:posOffset>1</wp:posOffset>
             </wp:positionH>
             <wp:positionV relativeFrom="paragraph">
               <wp:posOffset>114300</wp:posOffset>
             </wp:positionV>
-            <wp:extent cx="831912" cy="823913"/>
+            <wp:extent cx="828675" cy="836720"/>
             <wp:effectExtent b="0" l="0" r="0" t="0"/>
             <wp:wrapSquare wrapText="bothSides" distB="114300" distT="114300" distL="114300" distR="114300"/>
             <wp:docPr id="1" name="image1.png"/>
@@ -49,7 +49,7 @@
                   </pic:nvPicPr>
                   <pic:blipFill>
                     <a:blip r:embed="rId6"/>
-                    <a:srcRect b="0" l="0" r="0" t="0"/>
+                    <a:srcRect b="0" l="481" r="481" t="0"/>
                     <a:stretch>
                       <a:fillRect/>
                     </a:stretch>
@@ -57,7 +57,7 @@
                   <pic:spPr>
                     <a:xfrm>
                       <a:off x="0" y="0"/>
-                      <a:ext cx="831912" cy="823913"/>
+                      <a:ext cx="828675" cy="836720"/>
                     </a:xfrm>
                     <a:prstGeom prst="rect"/>
                     <a:ln/>
@@ -97,59 +97,14 @@
           <w:szCs w:val="26"/>
           <w:rtl w:val="0"/>
         </w:rPr>
-        <w:t xml:space="preserve">    </w:t>
-      </w:r>
-    </w:p>
-    <w:p>
-      <w:pPr>
-        <w:pBdr>
-          <w:top w:space="0" w:sz="0" w:val="nil"/>
-          <w:left w:space="0" w:sz="0" w:val="nil"/>
-          <w:bottom w:space="0" w:sz="0" w:val="nil"/>
-          <w:right w:space="0" w:sz="0" w:val="nil"/>
-          <w:between w:space="0" w:sz="0" w:val="nil"/>
-        </w:pBdr>
-        <w:spacing w:before="91" w:lineRule="auto"/>
-        <w:ind w:left="-425" w:right="-156" w:firstLine="570"/>
-        <w:jc w:val="center"/>
-        <w:rPr>
-          <w:rFonts w:ascii="Calibri" w:cs="Calibri" w:eastAsia="Calibri" w:hAnsi="Calibri"/>
-          <w:color w:val="000000"/>
-        </w:rPr>
-      </w:pPr>
-      <w:r>
-        <w:rPr>
-          <w:rFonts w:ascii="Calibri" w:cs="Calibri" w:eastAsia="Calibri" w:hAnsi="Calibri"/>
-          <w:b w:val="1"/>
-          <w:bCs w:val="1"/>
-          <w:sz w:val="26"/>
-          <w:szCs w:val="26"/>
-          <w:rtl w:val="0"/>
-        </w:rPr>
-        <w:t xml:space="preserve">Lucas PERTUSA</w:t>
-      </w:r>
-      <w:r>
-        <w:rPr>
-          <w:rFonts w:ascii="Calibri" w:cs="Calibri" w:eastAsia="Calibri" w:hAnsi="Calibri"/>
-          <w:color w:val="000000"/>
-          <w:rtl w:val="0"/>
-        </w:rPr>
-        <w:t xml:space="preserve">  </w:t>
-      </w:r>
-      <w:r>
-        <w:rPr>
-          <w:rFonts w:ascii="Calibri" w:cs="Calibri" w:eastAsia="Calibri" w:hAnsi="Calibri"/>
-          <w:rtl w:val="0"/>
-        </w:rPr>
-        <w:t xml:space="preserve">Clamart 92</w:t>
-      </w:r>
-      <w:r>
-        <w:rPr>
-          <w:rFonts w:ascii="Calibri" w:cs="Calibri" w:eastAsia="Calibri" w:hAnsi="Calibri"/>
-          <w:color w:val="000000"/>
-          <w:rtl w:val="0"/>
-        </w:rPr>
-        <w:t xml:space="preserve"> • </w:t>
+        <w:t xml:space="preserve">           Lucas PERTUSA</w:t>
+      </w:r>
+      <w:r>
+        <w:rPr>
+          <w:rFonts w:ascii="Calibri" w:cs="Calibri" w:eastAsia="Calibri" w:hAnsi="Calibri"/>
+          <w:rtl w:val="0"/>
+        </w:rPr>
+        <w:t xml:space="preserve">  Clamart 92 • </w:t>
       </w:r>
       <w:hyperlink r:id="rId7">
         <w:r>
@@ -165,10 +120,14 @@
       <w:r>
         <w:rPr>
           <w:rFonts w:ascii="Calibri" w:cs="Calibri" w:eastAsia="Calibri" w:hAnsi="Calibri"/>
-          <w:color w:val="000000"/>
           <w:rtl w:val="0"/>
         </w:rPr>
         <w:t xml:space="preserve"> • +33 07 66 40 32 00</w:t>
+      </w:r>
+      <w:r>
+        <w:rPr>
+          <w:rtl w:val="0"/>
+        </w:rPr>
       </w:r>
     </w:p>
     <w:p>
@@ -200,6 +159,36 @@
           <w:rtl w:val="0"/>
         </w:rPr>
         <w:t xml:space="preserve">Éducation</w:t>
+      </w:r>
+    </w:p>
+    <w:p>
+      <w:pPr>
+        <w:pStyle w:val="Heading1"/>
+        <w:ind w:left="0" w:firstLine="0"/>
+        <w:jc w:val="left"/>
+        <w:rPr>
+          <w:rFonts w:ascii="Calibri" w:cs="Calibri" w:eastAsia="Calibri" w:hAnsi="Calibri"/>
+        </w:rPr>
+      </w:pPr>
+      <w:r>
+        <w:rPr>
+          <w:rtl w:val="0"/>
+        </w:rPr>
+      </w:r>
+    </w:p>
+    <w:p>
+      <w:pPr>
+        <w:pStyle w:val="Heading1"/>
+        <w:ind w:left="0" w:firstLine="0"/>
+        <w:jc w:val="left"/>
+        <w:rPr>
+          <w:rFonts w:ascii="Calibri" w:cs="Calibri" w:eastAsia="Calibri" w:hAnsi="Calibri"/>
+        </w:rPr>
+      </w:pPr>
+      <w:r>
+        <w:rPr>
+          <w:rtl w:val="0"/>
+        </w:rPr>
       </w:r>
     </w:p>
     <w:p>
@@ -534,9 +523,7 @@
           <w:bCs w:val="1"/>
         </w:rPr>
       </w:pPr>
-      <w:r>
-        <w:br w:type="column"/>
-      </w:r>
+      <w:r/>
       <w:r>
         <w:rPr>
           <w:rtl w:val="0"/>
@@ -572,11 +559,7 @@
           <w:type w:val="continuous"/>
           <w:pgSz w:h="15840" w:w="12240" w:orient="portrait"/>
           <w:pgMar w:bottom="280" w:top="1280" w:left="600" w:right="630" w:header="720" w:footer="720"/>
-          <w:cols w:equalWidth="0" w:num="3">
-            <w:col w:space="0" w:w="3670"/>
-            <w:col w:space="0" w:w="3670"/>
-            <w:col w:space="0" w:w="3670"/>
-          </w:cols>
+          <w:cols w:equalWidth="0" w:num="1"/>
         </w:sectPr>
       </w:pPr>
       <w:r>

</xml_diff>